<commit_message>
docs(outputs): split summary test cases per code branch (816 -> 822)
TC-17..22 now cover _v0 only and TC-23..28 _v1 only, so no record mixes
the two branches. Regenerates the case register, xlsx, group report and
the Minh/Nhat excerpts, and updates README, KIEM_TRA, provenance and
checksums to 822 records.
</commit_message>
<xml_diff>
--- a/outputs/Nhom13_PhanViec_ca_nhan/Nhom13_23010359_NguyenDuyMinh_PhanViec.docx
+++ b/outputs/Nhom13_PhanViec_ca_nhan/Nhom13_23010359_NguyenDuyMinh_PhanViec.docx
@@ -611,7 +611,7 @@
           <w:r>
             <w:fldChar w:fldCharType="separate"/>
           </w:r>
-          <w:hyperlink w:anchor="_Toc243827853" w:history="1">
+          <w:hyperlink w:anchor="_Toc244207150" w:history="1">
             <w:r>
               <w:rPr>
                 <w:rStyle w:val="Hyperlink"/>
@@ -638,7 +638,7 @@
                 <w:noProof/>
                 <w:webHidden/>
               </w:rPr>
-              <w:instrText xml:space="preserve"> PAGEREF _Toc243827853 \h </w:instrText>
+              <w:instrText xml:space="preserve"> PAGEREF _Toc244207150 \h </w:instrText>
             </w:r>
             <w:r>
               <w:rPr>
@@ -685,7 +685,7 @@
               <w14:ligatures w14:val="standardContextual"/>
             </w:rPr>
           </w:pPr>
-          <w:hyperlink w:anchor="_Toc243827854" w:history="1">
+          <w:hyperlink w:anchor="_Toc244207151" w:history="1">
             <w:r>
               <w:rPr>
                 <w:rStyle w:val="Hyperlink"/>
@@ -713,7 +713,7 @@
                 <w:noProof/>
                 <w:webHidden/>
               </w:rPr>
-              <w:instrText xml:space="preserve"> PAGEREF _Toc243827854 \h </w:instrText>
+              <w:instrText xml:space="preserve"> PAGEREF _Toc244207151 \h </w:instrText>
             </w:r>
             <w:r>
               <w:rPr>
@@ -759,7 +759,7 @@
               <w14:ligatures w14:val="standardContextual"/>
             </w:rPr>
           </w:pPr>
-          <w:hyperlink w:anchor="_Toc243827855" w:history="1">
+          <w:hyperlink w:anchor="_Toc244207152" w:history="1">
             <w:r>
               <w:rPr>
                 <w:rStyle w:val="Hyperlink"/>
@@ -796,7 +796,7 @@
                 <w:noProof/>
                 <w:webHidden/>
               </w:rPr>
-              <w:instrText xml:space="preserve"> PAGEREF _Toc243827855 \h </w:instrText>
+              <w:instrText xml:space="preserve"> PAGEREF _Toc244207152 \h </w:instrText>
             </w:r>
             <w:r>
               <w:rPr>
@@ -842,7 +842,7 @@
               <w14:ligatures w14:val="standardContextual"/>
             </w:rPr>
           </w:pPr>
-          <w:hyperlink w:anchor="_Toc243827856" w:history="1">
+          <w:hyperlink w:anchor="_Toc244207153" w:history="1">
             <w:r>
               <w:rPr>
                 <w:rStyle w:val="Hyperlink"/>
@@ -870,7 +870,7 @@
                 <w:noProof/>
                 <w:webHidden/>
               </w:rPr>
-              <w:instrText xml:space="preserve"> PAGEREF _Toc243827856 \h </w:instrText>
+              <w:instrText xml:space="preserve"> PAGEREF _Toc244207153 \h </w:instrText>
             </w:r>
             <w:r>
               <w:rPr>
@@ -916,7 +916,7 @@
               <w14:ligatures w14:val="standardContextual"/>
             </w:rPr>
           </w:pPr>
-          <w:hyperlink w:anchor="_Toc243827857" w:history="1">
+          <w:hyperlink w:anchor="_Toc244207154" w:history="1">
             <w:r>
               <w:rPr>
                 <w:rStyle w:val="Hyperlink"/>
@@ -944,7 +944,7 @@
                 <w:noProof/>
                 <w:webHidden/>
               </w:rPr>
-              <w:instrText xml:space="preserve"> PAGEREF _Toc243827857 \h </w:instrText>
+              <w:instrText xml:space="preserve"> PAGEREF _Toc244207154 \h </w:instrText>
             </w:r>
             <w:r>
               <w:rPr>
@@ -990,7 +990,7 @@
               <w14:ligatures w14:val="standardContextual"/>
             </w:rPr>
           </w:pPr>
-          <w:hyperlink w:anchor="_Toc243827858" w:history="1">
+          <w:hyperlink w:anchor="_Toc244207155" w:history="1">
             <w:r>
               <w:rPr>
                 <w:rStyle w:val="Hyperlink"/>
@@ -1018,7 +1018,7 @@
                 <w:noProof/>
                 <w:webHidden/>
               </w:rPr>
-              <w:instrText xml:space="preserve"> PAGEREF _Toc243827858 \h </w:instrText>
+              <w:instrText xml:space="preserve"> PAGEREF _Toc244207155 \h </w:instrText>
             </w:r>
             <w:r>
               <w:rPr>
@@ -1064,7 +1064,7 @@
               <w14:ligatures w14:val="standardContextual"/>
             </w:rPr>
           </w:pPr>
-          <w:hyperlink w:anchor="_Toc243827859" w:history="1">
+          <w:hyperlink w:anchor="_Toc244207156" w:history="1">
             <w:r>
               <w:rPr>
                 <w:rStyle w:val="Hyperlink"/>
@@ -1092,7 +1092,7 @@
                 <w:noProof/>
                 <w:webHidden/>
               </w:rPr>
-              <w:instrText xml:space="preserve"> PAGEREF _Toc243827859 \h </w:instrText>
+              <w:instrText xml:space="preserve"> PAGEREF _Toc244207156 \h </w:instrText>
             </w:r>
             <w:r>
               <w:rPr>
@@ -1139,7 +1139,7 @@
               <w14:ligatures w14:val="standardContextual"/>
             </w:rPr>
           </w:pPr>
-          <w:hyperlink w:anchor="_Toc243827860" w:history="1">
+          <w:hyperlink w:anchor="_Toc244207157" w:history="1">
             <w:r>
               <w:rPr>
                 <w:rStyle w:val="Hyperlink"/>
@@ -1167,7 +1167,7 @@
                 <w:noProof/>
                 <w:webHidden/>
               </w:rPr>
-              <w:instrText xml:space="preserve"> PAGEREF _Toc243827860 \h </w:instrText>
+              <w:instrText xml:space="preserve"> PAGEREF _Toc244207157 \h </w:instrText>
             </w:r>
             <w:r>
               <w:rPr>
@@ -1213,7 +1213,7 @@
               <w14:ligatures w14:val="standardContextual"/>
             </w:rPr>
           </w:pPr>
-          <w:hyperlink w:anchor="_Toc243827861" w:history="1">
+          <w:hyperlink w:anchor="_Toc244207158" w:history="1">
             <w:r>
               <w:rPr>
                 <w:rStyle w:val="Hyperlink"/>
@@ -1241,7 +1241,7 @@
                 <w:noProof/>
                 <w:webHidden/>
               </w:rPr>
-              <w:instrText xml:space="preserve"> PAGEREF _Toc243827861 \h </w:instrText>
+              <w:instrText xml:space="preserve"> PAGEREF _Toc244207158 \h </w:instrText>
             </w:r>
             <w:r>
               <w:rPr>
@@ -1287,7 +1287,7 @@
               <w14:ligatures w14:val="standardContextual"/>
             </w:rPr>
           </w:pPr>
-          <w:hyperlink w:anchor="_Toc243827862" w:history="1">
+          <w:hyperlink w:anchor="_Toc244207159" w:history="1">
             <w:r>
               <w:rPr>
                 <w:rStyle w:val="Hyperlink"/>
@@ -1315,7 +1315,7 @@
                 <w:noProof/>
                 <w:webHidden/>
               </w:rPr>
-              <w:instrText xml:space="preserve"> PAGEREF _Toc243827862 \h </w:instrText>
+              <w:instrText xml:space="preserve"> PAGEREF _Toc244207159 \h </w:instrText>
             </w:r>
             <w:r>
               <w:rPr>
@@ -1361,7 +1361,7 @@
               <w14:ligatures w14:val="standardContextual"/>
             </w:rPr>
           </w:pPr>
-          <w:hyperlink w:anchor="_Toc243827863" w:history="1">
+          <w:hyperlink w:anchor="_Toc244207160" w:history="1">
             <w:r>
               <w:rPr>
                 <w:rStyle w:val="Hyperlink"/>
@@ -1389,7 +1389,7 @@
                 <w:noProof/>
                 <w:webHidden/>
               </w:rPr>
-              <w:instrText xml:space="preserve"> PAGEREF _Toc243827863 \h </w:instrText>
+              <w:instrText xml:space="preserve"> PAGEREF _Toc244207160 \h </w:instrText>
             </w:r>
             <w:r>
               <w:rPr>
@@ -1435,7 +1435,7 @@
               <w14:ligatures w14:val="standardContextual"/>
             </w:rPr>
           </w:pPr>
-          <w:hyperlink w:anchor="_Toc243827864" w:history="1">
+          <w:hyperlink w:anchor="_Toc244207161" w:history="1">
             <w:r>
               <w:rPr>
                 <w:rStyle w:val="Hyperlink"/>
@@ -1463,7 +1463,7 @@
                 <w:noProof/>
                 <w:webHidden/>
               </w:rPr>
-              <w:instrText xml:space="preserve"> PAGEREF _Toc243827864 \h </w:instrText>
+              <w:instrText xml:space="preserve"> PAGEREF _Toc244207161 \h </w:instrText>
             </w:r>
             <w:r>
               <w:rPr>
@@ -1509,7 +1509,7 @@
               <w14:ligatures w14:val="standardContextual"/>
             </w:rPr>
           </w:pPr>
-          <w:hyperlink w:anchor="_Toc243827865" w:history="1">
+          <w:hyperlink w:anchor="_Toc244207162" w:history="1">
             <w:r>
               <w:rPr>
                 <w:rStyle w:val="Hyperlink"/>
@@ -1537,7 +1537,7 @@
                 <w:noProof/>
                 <w:webHidden/>
               </w:rPr>
-              <w:instrText xml:space="preserve"> PAGEREF _Toc243827865 \h </w:instrText>
+              <w:instrText xml:space="preserve"> PAGEREF _Toc244207162 \h </w:instrText>
             </w:r>
             <w:r>
               <w:rPr>
@@ -1583,7 +1583,7 @@
               <w14:ligatures w14:val="standardContextual"/>
             </w:rPr>
           </w:pPr>
-          <w:hyperlink w:anchor="_Toc243827866" w:history="1">
+          <w:hyperlink w:anchor="_Toc244207163" w:history="1">
             <w:r>
               <w:rPr>
                 <w:rStyle w:val="Hyperlink"/>
@@ -1610,7 +1610,7 @@
                 <w:noProof/>
                 <w:webHidden/>
               </w:rPr>
-              <w:instrText xml:space="preserve"> PAGEREF _Toc243827866 \h </w:instrText>
+              <w:instrText xml:space="preserve"> PAGEREF _Toc244207163 \h </w:instrText>
             </w:r>
             <w:r>
               <w:rPr>
@@ -1657,7 +1657,7 @@
               <w14:ligatures w14:val="standardContextual"/>
             </w:rPr>
           </w:pPr>
-          <w:hyperlink w:anchor="_Toc243827867" w:history="1">
+          <w:hyperlink w:anchor="_Toc244207164" w:history="1">
             <w:r>
               <w:rPr>
                 <w:rStyle w:val="Hyperlink"/>
@@ -1685,7 +1685,7 @@
                 <w:noProof/>
                 <w:webHidden/>
               </w:rPr>
-              <w:instrText xml:space="preserve"> PAGEREF _Toc243827867 \h </w:instrText>
+              <w:instrText xml:space="preserve"> PAGEREF _Toc244207164 \h </w:instrText>
             </w:r>
             <w:r>
               <w:rPr>
@@ -1731,7 +1731,7 @@
               <w14:ligatures w14:val="standardContextual"/>
             </w:rPr>
           </w:pPr>
-          <w:hyperlink w:anchor="_Toc243827868" w:history="1">
+          <w:hyperlink w:anchor="_Toc244207165" w:history="1">
             <w:r>
               <w:rPr>
                 <w:rStyle w:val="Hyperlink"/>
@@ -1759,7 +1759,7 @@
                 <w:noProof/>
                 <w:webHidden/>
               </w:rPr>
-              <w:instrText xml:space="preserve"> PAGEREF _Toc243827868 \h </w:instrText>
+              <w:instrText xml:space="preserve"> PAGEREF _Toc244207165 \h </w:instrText>
             </w:r>
             <w:r>
               <w:rPr>
@@ -1805,7 +1805,7 @@
               <w14:ligatures w14:val="standardContextual"/>
             </w:rPr>
           </w:pPr>
-          <w:hyperlink w:anchor="_Toc243827869" w:history="1">
+          <w:hyperlink w:anchor="_Toc244207166" w:history="1">
             <w:r>
               <w:rPr>
                 <w:rStyle w:val="Hyperlink"/>
@@ -1833,7 +1833,7 @@
                 <w:noProof/>
                 <w:webHidden/>
               </w:rPr>
-              <w:instrText xml:space="preserve"> PAGEREF _Toc243827869 \h </w:instrText>
+              <w:instrText xml:space="preserve"> PAGEREF _Toc244207166 \h </w:instrText>
             </w:r>
             <w:r>
               <w:rPr>
@@ -1879,7 +1879,7 @@
               <w14:ligatures w14:val="standardContextual"/>
             </w:rPr>
           </w:pPr>
-          <w:hyperlink w:anchor="_Toc243827870" w:history="1">
+          <w:hyperlink w:anchor="_Toc244207167" w:history="1">
             <w:r>
               <w:rPr>
                 <w:rStyle w:val="Hyperlink"/>
@@ -1907,7 +1907,7 @@
                 <w:noProof/>
                 <w:webHidden/>
               </w:rPr>
-              <w:instrText xml:space="preserve"> PAGEREF _Toc243827870 \h </w:instrText>
+              <w:instrText xml:space="preserve"> PAGEREF _Toc244207167 \h </w:instrText>
             </w:r>
             <w:r>
               <w:rPr>
@@ -1953,7 +1953,7 @@
               <w14:ligatures w14:val="standardContextual"/>
             </w:rPr>
           </w:pPr>
-          <w:hyperlink w:anchor="_Toc243827871" w:history="1">
+          <w:hyperlink w:anchor="_Toc244207168" w:history="1">
             <w:r>
               <w:rPr>
                 <w:rStyle w:val="Hyperlink"/>
@@ -1981,7 +1981,7 @@
                 <w:noProof/>
                 <w:webHidden/>
               </w:rPr>
-              <w:instrText xml:space="preserve"> PAGEREF _Toc243827871 \h </w:instrText>
+              <w:instrText xml:space="preserve"> PAGEREF _Toc244207168 \h </w:instrText>
             </w:r>
             <w:r>
               <w:rPr>
@@ -2027,7 +2027,7 @@
               <w14:ligatures w14:val="standardContextual"/>
             </w:rPr>
           </w:pPr>
-          <w:hyperlink w:anchor="_Toc243827872" w:history="1">
+          <w:hyperlink w:anchor="_Toc244207169" w:history="1">
             <w:r>
               <w:rPr>
                 <w:rStyle w:val="Hyperlink"/>
@@ -2055,7 +2055,7 @@
                 <w:noProof/>
                 <w:webHidden/>
               </w:rPr>
-              <w:instrText xml:space="preserve"> PAGEREF _Toc243827872 \h </w:instrText>
+              <w:instrText xml:space="preserve"> PAGEREF _Toc244207169 \h </w:instrText>
             </w:r>
             <w:r>
               <w:rPr>
@@ -2101,7 +2101,7 @@
               <w14:ligatures w14:val="standardContextual"/>
             </w:rPr>
           </w:pPr>
-          <w:hyperlink w:anchor="_Toc243827873" w:history="1">
+          <w:hyperlink w:anchor="_Toc244207170" w:history="1">
             <w:r>
               <w:rPr>
                 <w:rStyle w:val="Hyperlink"/>
@@ -2129,7 +2129,7 @@
                 <w:noProof/>
                 <w:webHidden/>
               </w:rPr>
-              <w:instrText xml:space="preserve"> PAGEREF _Toc243827873 \h </w:instrText>
+              <w:instrText xml:space="preserve"> PAGEREF _Toc244207170 \h </w:instrText>
             </w:r>
             <w:r>
               <w:rPr>
@@ -2176,7 +2176,7 @@
               <w14:ligatures w14:val="standardContextual"/>
             </w:rPr>
           </w:pPr>
-          <w:hyperlink w:anchor="_Toc243827874" w:history="1">
+          <w:hyperlink w:anchor="_Toc244207171" w:history="1">
             <w:r>
               <w:rPr>
                 <w:rStyle w:val="Hyperlink"/>
@@ -2203,7 +2203,7 @@
                 <w:noProof/>
                 <w:webHidden/>
               </w:rPr>
-              <w:instrText xml:space="preserve"> PAGEREF _Toc243827874 \h </w:instrText>
+              <w:instrText xml:space="preserve"> PAGEREF _Toc244207171 \h </w:instrText>
             </w:r>
             <w:r>
               <w:rPr>
@@ -2249,7 +2249,7 @@
               <w14:ligatures w14:val="standardContextual"/>
             </w:rPr>
           </w:pPr>
-          <w:hyperlink w:anchor="_Toc243827875" w:history="1">
+          <w:hyperlink w:anchor="_Toc244207172" w:history="1">
             <w:r>
               <w:rPr>
                 <w:rStyle w:val="Hyperlink"/>
@@ -2276,7 +2276,7 @@
                 <w:noProof/>
                 <w:webHidden/>
               </w:rPr>
-              <w:instrText xml:space="preserve"> PAGEREF _Toc243827875 \h </w:instrText>
+              <w:instrText xml:space="preserve"> PAGEREF _Toc244207172 \h </w:instrText>
             </w:r>
             <w:r>
               <w:rPr>
@@ -2322,7 +2322,7 @@
               <w14:ligatures w14:val="standardContextual"/>
             </w:rPr>
           </w:pPr>
-          <w:hyperlink w:anchor="_Toc243827876" w:history="1">
+          <w:hyperlink w:anchor="_Toc244207173" w:history="1">
             <w:r>
               <w:rPr>
                 <w:rStyle w:val="Hyperlink"/>
@@ -2349,7 +2349,7 @@
                 <w:noProof/>
                 <w:webHidden/>
               </w:rPr>
-              <w:instrText xml:space="preserve"> PAGEREF _Toc243827876 \h </w:instrText>
+              <w:instrText xml:space="preserve"> PAGEREF _Toc244207173 \h </w:instrText>
             </w:r>
             <w:r>
               <w:rPr>
@@ -2395,7 +2395,7 @@
               <w14:ligatures w14:val="standardContextual"/>
             </w:rPr>
           </w:pPr>
-          <w:hyperlink w:anchor="_Toc243827877" w:history="1">
+          <w:hyperlink w:anchor="_Toc244207174" w:history="1">
             <w:r>
               <w:rPr>
                 <w:rStyle w:val="Hyperlink"/>
@@ -2422,7 +2422,7 @@
                 <w:noProof/>
                 <w:webHidden/>
               </w:rPr>
-              <w:instrText xml:space="preserve"> PAGEREF _Toc243827877 \h </w:instrText>
+              <w:instrText xml:space="preserve"> PAGEREF _Toc244207174 \h </w:instrText>
             </w:r>
             <w:r>
               <w:rPr>
@@ -2469,7 +2469,7 @@
               <w14:ligatures w14:val="standardContextual"/>
             </w:rPr>
           </w:pPr>
-          <w:hyperlink w:anchor="_Toc243827878" w:history="1">
+          <w:hyperlink w:anchor="_Toc244207175" w:history="1">
             <w:r>
               <w:rPr>
                 <w:rStyle w:val="Hyperlink"/>
@@ -2496,7 +2496,7 @@
                 <w:noProof/>
                 <w:webHidden/>
               </w:rPr>
-              <w:instrText xml:space="preserve"> PAGEREF _Toc243827878 \h </w:instrText>
+              <w:instrText xml:space="preserve"> PAGEREF _Toc244207175 \h </w:instrText>
             </w:r>
             <w:r>
               <w:rPr>
@@ -2542,7 +2542,7 @@
               <w14:ligatures w14:val="standardContextual"/>
             </w:rPr>
           </w:pPr>
-          <w:hyperlink w:anchor="_Toc243827879" w:history="1">
+          <w:hyperlink w:anchor="_Toc244207176" w:history="1">
             <w:r>
               <w:rPr>
                 <w:rStyle w:val="Hyperlink"/>
@@ -2569,7 +2569,7 @@
                 <w:noProof/>
                 <w:webHidden/>
               </w:rPr>
-              <w:instrText xml:space="preserve"> PAGEREF _Toc243827879 \h </w:instrText>
+              <w:instrText xml:space="preserve"> PAGEREF _Toc244207176 \h </w:instrText>
             </w:r>
             <w:r>
               <w:rPr>
@@ -2615,7 +2615,7 @@
               <w14:ligatures w14:val="standardContextual"/>
             </w:rPr>
           </w:pPr>
-          <w:hyperlink w:anchor="_Toc243827880" w:history="1">
+          <w:hyperlink w:anchor="_Toc244207177" w:history="1">
             <w:r>
               <w:rPr>
                 <w:rStyle w:val="Hyperlink"/>
@@ -2642,7 +2642,7 @@
                 <w:noProof/>
                 <w:webHidden/>
               </w:rPr>
-              <w:instrText xml:space="preserve"> PAGEREF _Toc243827880 \h </w:instrText>
+              <w:instrText xml:space="preserve"> PAGEREF _Toc244207177 \h </w:instrText>
             </w:r>
             <w:r>
               <w:rPr>
@@ -2688,7 +2688,7 @@
               <w14:ligatures w14:val="standardContextual"/>
             </w:rPr>
           </w:pPr>
-          <w:hyperlink w:anchor="_Toc243827881" w:history="1">
+          <w:hyperlink w:anchor="_Toc244207178" w:history="1">
             <w:r>
               <w:rPr>
                 <w:rStyle w:val="Hyperlink"/>
@@ -2715,7 +2715,7 @@
                 <w:noProof/>
                 <w:webHidden/>
               </w:rPr>
-              <w:instrText xml:space="preserve"> PAGEREF _Toc243827881 \h </w:instrText>
+              <w:instrText xml:space="preserve"> PAGEREF _Toc244207178 \h </w:instrText>
             </w:r>
             <w:r>
               <w:rPr>
@@ -2762,7 +2762,7 @@
               <w14:ligatures w14:val="standardContextual"/>
             </w:rPr>
           </w:pPr>
-          <w:hyperlink w:anchor="_Toc243827882" w:history="1">
+          <w:hyperlink w:anchor="_Toc244207179" w:history="1">
             <w:r>
               <w:rPr>
                 <w:rStyle w:val="Hyperlink"/>
@@ -2790,7 +2790,7 @@
                 <w:noProof/>
                 <w:webHidden/>
               </w:rPr>
-              <w:instrText xml:space="preserve"> PAGEREF _Toc243827882 \h </w:instrText>
+              <w:instrText xml:space="preserve"> PAGEREF _Toc244207179 \h </w:instrText>
             </w:r>
             <w:r>
               <w:rPr>
@@ -2836,7 +2836,7 @@
               <w14:ligatures w14:val="standardContextual"/>
             </w:rPr>
           </w:pPr>
-          <w:hyperlink w:anchor="_Toc243827883" w:history="1">
+          <w:hyperlink w:anchor="_Toc244207180" w:history="1">
             <w:r>
               <w:rPr>
                 <w:rStyle w:val="Hyperlink"/>
@@ -2864,7 +2864,7 @@
                 <w:noProof/>
                 <w:webHidden/>
               </w:rPr>
-              <w:instrText xml:space="preserve"> PAGEREF _Toc243827883 \h </w:instrText>
+              <w:instrText xml:space="preserve"> PAGEREF _Toc244207180 \h </w:instrText>
             </w:r>
             <w:r>
               <w:rPr>
@@ -2910,7 +2910,7 @@
               <w14:ligatures w14:val="standardContextual"/>
             </w:rPr>
           </w:pPr>
-          <w:hyperlink w:anchor="_Toc243827884" w:history="1">
+          <w:hyperlink w:anchor="_Toc244207181" w:history="1">
             <w:r>
               <w:rPr>
                 <w:rStyle w:val="Hyperlink"/>
@@ -2938,7 +2938,7 @@
                 <w:noProof/>
                 <w:webHidden/>
               </w:rPr>
-              <w:instrText xml:space="preserve"> PAGEREF _Toc243827884 \h </w:instrText>
+              <w:instrText xml:space="preserve"> PAGEREF _Toc244207181 \h </w:instrText>
             </w:r>
             <w:r>
               <w:rPr>
@@ -2984,7 +2984,7 @@
               <w14:ligatures w14:val="standardContextual"/>
             </w:rPr>
           </w:pPr>
-          <w:hyperlink w:anchor="_Toc243827885" w:history="1">
+          <w:hyperlink w:anchor="_Toc244207182" w:history="1">
             <w:r>
               <w:rPr>
                 <w:rStyle w:val="Hyperlink"/>
@@ -3012,7 +3012,7 @@
                 <w:noProof/>
                 <w:webHidden/>
               </w:rPr>
-              <w:instrText xml:space="preserve"> PAGEREF _Toc243827885 \h </w:instrText>
+              <w:instrText xml:space="preserve"> PAGEREF _Toc244207182 \h </w:instrText>
             </w:r>
             <w:r>
               <w:rPr>
@@ -3058,7 +3058,7 @@
               <w14:ligatures w14:val="standardContextual"/>
             </w:rPr>
           </w:pPr>
-          <w:hyperlink w:anchor="_Toc243827886" w:history="1">
+          <w:hyperlink w:anchor="_Toc244207183" w:history="1">
             <w:r>
               <w:rPr>
                 <w:rStyle w:val="Hyperlink"/>
@@ -3086,7 +3086,7 @@
                 <w:noProof/>
                 <w:webHidden/>
               </w:rPr>
-              <w:instrText xml:space="preserve"> PAGEREF _Toc243827886 \h </w:instrText>
+              <w:instrText xml:space="preserve"> PAGEREF _Toc244207183 \h </w:instrText>
             </w:r>
             <w:r>
               <w:rPr>
@@ -3132,7 +3132,7 @@
               <w14:ligatures w14:val="standardContextual"/>
             </w:rPr>
           </w:pPr>
-          <w:hyperlink w:anchor="_Toc243827887" w:history="1">
+          <w:hyperlink w:anchor="_Toc244207184" w:history="1">
             <w:r>
               <w:rPr>
                 <w:rStyle w:val="Hyperlink"/>
@@ -3160,7 +3160,7 @@
                 <w:noProof/>
                 <w:webHidden/>
               </w:rPr>
-              <w:instrText xml:space="preserve"> PAGEREF _Toc243827887 \h </w:instrText>
+              <w:instrText xml:space="preserve"> PAGEREF _Toc244207184 \h </w:instrText>
             </w:r>
             <w:r>
               <w:rPr>
@@ -3206,7 +3206,7 @@
               <w14:ligatures w14:val="standardContextual"/>
             </w:rPr>
           </w:pPr>
-          <w:hyperlink w:anchor="_Toc243827888" w:history="1">
+          <w:hyperlink w:anchor="_Toc244207185" w:history="1">
             <w:r>
               <w:rPr>
                 <w:rStyle w:val="Hyperlink"/>
@@ -3234,7 +3234,7 @@
                 <w:noProof/>
                 <w:webHidden/>
               </w:rPr>
-              <w:instrText xml:space="preserve"> PAGEREF _Toc243827888 \h </w:instrText>
+              <w:instrText xml:space="preserve"> PAGEREF _Toc244207185 \h </w:instrText>
             </w:r>
             <w:r>
               <w:rPr>
@@ -3280,7 +3280,7 @@
               <w14:ligatures w14:val="standardContextual"/>
             </w:rPr>
           </w:pPr>
-          <w:hyperlink w:anchor="_Toc243827889" w:history="1">
+          <w:hyperlink w:anchor="_Toc244207186" w:history="1">
             <w:r>
               <w:rPr>
                 <w:rStyle w:val="Hyperlink"/>
@@ -3307,7 +3307,7 @@
                 <w:noProof/>
                 <w:webHidden/>
               </w:rPr>
-              <w:instrText xml:space="preserve"> PAGEREF _Toc243827889 \h </w:instrText>
+              <w:instrText xml:space="preserve"> PAGEREF _Toc244207186 \h </w:instrText>
             </w:r>
             <w:r>
               <w:rPr>
@@ -3357,7 +3357,7 @@
         </w:numPr>
       </w:pPr>
       <w:bookmarkStart w:id="5" w:name="_Toc175554962"/>
-      <w:bookmarkStart w:id="6" w:name="_Toc243827853"/>
+      <w:bookmarkStart w:id="6" w:name="_Toc244207150"/>
       <w:r>
         <w:t>Phân công thực hiện đồ án</w:t>
       </w:r>
@@ -4256,7 +4256,7 @@
           <w:numId w:val="0"/>
         </w:numPr>
       </w:pPr>
-      <w:bookmarkStart w:id="7" w:name="_Toc243827854"/>
+      <w:bookmarkStart w:id="7" w:name="_Toc244207151"/>
       <w:r>
         <w:rPr>
           <w:lang w:val="vi-VN"/>
@@ -4274,7 +4274,7 @@
           <w:numId w:val="0"/>
         </w:numPr>
       </w:pPr>
-      <w:bookmarkStart w:id="8" w:name="_Toc243827855"/>
+      <w:bookmarkStart w:id="8" w:name="_Toc244207152"/>
       <w:r>
         <w:rPr>
           <w:lang w:val="vi-VN"/>
@@ -4301,7 +4301,7 @@
           <w:numId w:val="0"/>
         </w:numPr>
       </w:pPr>
-      <w:bookmarkStart w:id="9" w:name="_Toc243827856"/>
+      <w:bookmarkStart w:id="9" w:name="_Toc244207153"/>
       <w:r>
         <w:rPr>
           <w:lang w:val="vi-VN"/>
@@ -4917,7 +4917,7 @@
           <w:numId w:val="0"/>
         </w:numPr>
       </w:pPr>
-      <w:bookmarkStart w:id="11" w:name="_Toc243827857"/>
+      <w:bookmarkStart w:id="11" w:name="_Toc244207154"/>
       <w:r>
         <w:rPr>
           <w:lang w:val="vi-VN"/>
@@ -5375,7 +5375,7 @@
           <w:numId w:val="0"/>
         </w:numPr>
       </w:pPr>
-      <w:bookmarkStart w:id="13" w:name="_Toc243827858"/>
+      <w:bookmarkStart w:id="13" w:name="_Toc244207155"/>
       <w:r>
         <w:rPr>
           <w:lang w:val="vi-VN"/>
@@ -7861,7 +7861,7 @@
           <w:numId w:val="0"/>
         </w:numPr>
       </w:pPr>
-      <w:bookmarkStart w:id="16" w:name="_Toc243827859"/>
+      <w:bookmarkStart w:id="16" w:name="_Toc244207156"/>
       <w:r>
         <w:rPr>
           <w:lang w:val="vi-VN"/>
@@ -9700,7 +9700,7 @@
           <w:numId w:val="0"/>
         </w:numPr>
       </w:pPr>
-      <w:bookmarkStart w:id="18" w:name="_Toc243827860"/>
+      <w:bookmarkStart w:id="18" w:name="_Toc244207157"/>
       <w:r>
         <w:rPr>
           <w:lang w:val="vi-VN"/>
@@ -9718,7 +9718,7 @@
           <w:numId w:val="0"/>
         </w:numPr>
       </w:pPr>
-      <w:bookmarkStart w:id="19" w:name="_Toc243827861"/>
+      <w:bookmarkStart w:id="19" w:name="_Toc244207158"/>
       <w:r>
         <w:rPr>
           <w:lang w:val="vi-VN"/>
@@ -9736,7 +9736,7 @@
           <w:numId w:val="0"/>
         </w:numPr>
       </w:pPr>
-      <w:bookmarkStart w:id="20" w:name="_Toc243827862"/>
+      <w:bookmarkStart w:id="20" w:name="_Toc244207159"/>
       <w:r>
         <w:rPr>
           <w:lang w:val="vi-VN"/>
@@ -10812,7 +10812,7 @@
           <w:numId w:val="0"/>
         </w:numPr>
       </w:pPr>
-      <w:bookmarkStart w:id="22" w:name="_Toc243827863"/>
+      <w:bookmarkStart w:id="22" w:name="_Toc244207160"/>
       <w:r>
         <w:rPr>
           <w:lang w:val="vi-VN"/>
@@ -12483,7 +12483,7 @@
           <w:numId w:val="0"/>
         </w:numPr>
       </w:pPr>
-      <w:bookmarkStart w:id="25" w:name="_Toc243827864"/>
+      <w:bookmarkStart w:id="25" w:name="_Toc244207161"/>
       <w:r>
         <w:rPr>
           <w:lang w:val="vi-VN"/>
@@ -13468,7 +13468,7 @@
           <w:numId w:val="0"/>
         </w:numPr>
       </w:pPr>
-      <w:bookmarkStart w:id="29" w:name="_Toc243827865"/>
+      <w:bookmarkStart w:id="29" w:name="_Toc244207162"/>
       <w:r>
         <w:rPr>
           <w:lang w:val="vi-VN"/>
@@ -13525,7 +13525,7 @@
           <w:numId w:val="0"/>
         </w:numPr>
       </w:pPr>
-      <w:bookmarkStart w:id="30" w:name="_Toc243827866"/>
+      <w:bookmarkStart w:id="30" w:name="_Toc244207163"/>
       <w:r>
         <w:lastRenderedPageBreak/>
         <w:t>4.5 Quy trình vá và kiểm chứng trước, sau</w:t>
@@ -13965,7 +13965,7 @@
           <w:numId w:val="0"/>
         </w:numPr>
       </w:pPr>
-      <w:bookmarkStart w:id="31" w:name="_Toc243827867"/>
+      <w:bookmarkStart w:id="31" w:name="_Toc244207164"/>
       <w:r>
         <w:rPr>
           <w:lang w:val="vi-VN"/>
@@ -13983,7 +13983,7 @@
           <w:numId w:val="0"/>
         </w:numPr>
       </w:pPr>
-      <w:bookmarkStart w:id="32" w:name="_Toc243827868"/>
+      <w:bookmarkStart w:id="32" w:name="_Toc244207165"/>
       <w:r>
         <w:rPr>
           <w:lang w:val="vi-VN"/>
@@ -14001,7 +14001,7 @@
           <w:numId w:val="0"/>
         </w:numPr>
       </w:pPr>
-      <w:bookmarkStart w:id="33" w:name="_Toc243827869"/>
+      <w:bookmarkStart w:id="33" w:name="_Toc244207166"/>
       <w:r>
         <w:rPr>
           <w:lang w:val="vi-VN"/>
@@ -15600,7 +15600,7 @@
           <w:numId w:val="0"/>
         </w:numPr>
       </w:pPr>
-      <w:bookmarkStart w:id="35" w:name="_Toc243827870"/>
+      <w:bookmarkStart w:id="35" w:name="_Toc244207167"/>
       <w:r>
         <w:rPr>
           <w:lang w:val="vi-VN"/>
@@ -17081,7 +17081,7 @@
           <w:numId w:val="0"/>
         </w:numPr>
       </w:pPr>
-      <w:bookmarkStart w:id="38" w:name="_Toc243827871"/>
+      <w:bookmarkStart w:id="38" w:name="_Toc244207168"/>
       <w:r>
         <w:rPr>
           <w:lang w:val="vi-VN"/>
@@ -19126,7 +19126,7 @@
           <w:numId w:val="0"/>
         </w:numPr>
       </w:pPr>
-      <w:bookmarkStart w:id="42" w:name="_Toc243827872"/>
+      <w:bookmarkStart w:id="42" w:name="_Toc244207169"/>
       <w:r>
         <w:rPr>
           <w:lang w:val="vi-VN"/>
@@ -20619,7 +20619,7 @@
           <w:numId w:val="0"/>
         </w:numPr>
       </w:pPr>
-      <w:bookmarkStart w:id="44" w:name="_Toc243827873"/>
+      <w:bookmarkStart w:id="44" w:name="_Toc244207170"/>
       <w:r>
         <w:rPr>
           <w:lang w:val="vi-VN"/>
@@ -20667,7 +20667,7 @@
           <w:numId w:val="0"/>
         </w:numPr>
       </w:pPr>
-      <w:bookmarkStart w:id="45" w:name="_Toc243827874"/>
+      <w:bookmarkStart w:id="45" w:name="_Toc244207171"/>
       <w:r>
         <w:lastRenderedPageBreak/>
         <w:t>9. Bằng chứng kiểm chứng</w:t>
@@ -20712,7 +20712,7 @@
           <w:numId w:val="0"/>
         </w:numPr>
       </w:pPr>
-      <w:bookmarkStart w:id="46" w:name="_Toc243827875"/>
+      <w:bookmarkStart w:id="46" w:name="_Toc244207172"/>
       <w:r>
         <w:t>9.1 Số liệu trước và sau khi vá</w:t>
       </w:r>
@@ -21829,7 +21829,7 @@
           <w:numId w:val="0"/>
         </w:numPr>
       </w:pPr>
-      <w:bookmarkStart w:id="47" w:name="_Toc243827876"/>
+      <w:bookmarkStart w:id="47" w:name="_Toc244207173"/>
       <w:r>
         <w:lastRenderedPageBreak/>
         <w:t>9.2 Ảnh chụp bằng chứng trước khi vá (v0)</w:t>
@@ -22366,7 +22366,7 @@
           <w:numId w:val="0"/>
         </w:numPr>
       </w:pPr>
-      <w:bookmarkStart w:id="48" w:name="_Toc243827877"/>
+      <w:bookmarkStart w:id="48" w:name="_Toc244207174"/>
       <w:r>
         <w:t>9.3 Ảnh chụp bằng chứng sau khi vá (v1)</w:t>
       </w:r>
@@ -22995,7 +22995,7 @@
           <w:numId w:val="0"/>
         </w:numPr>
       </w:pPr>
-      <w:bookmarkStart w:id="49" w:name="_Toc243827878"/>
+      <w:bookmarkStart w:id="49" w:name="_Toc244207175"/>
       <w:r>
         <w:lastRenderedPageBreak/>
         <w:t>10. Phản biện &amp; Bài học</w:t>
@@ -23018,7 +23018,7 @@
           <w:numId w:val="0"/>
         </w:numPr>
       </w:pPr>
-      <w:bookmarkStart w:id="50" w:name="_Toc243827879"/>
+      <w:bookmarkStart w:id="50" w:name="_Toc244207176"/>
       <w:r>
         <w:t>10.1 Nếu làm lại từ đầu, nhóm sẽ thiết kế khác ở đâu?</w:t>
       </w:r>
@@ -23145,7 +23145,7 @@
           <w:numId w:val="0"/>
         </w:numPr>
       </w:pPr>
-      <w:bookmarkStart w:id="51" w:name="_Toc243827880"/>
+      <w:bookmarkStart w:id="51" w:name="_Toc244207177"/>
       <w:r>
         <w:t>10.2 Lỗ hổng nào nhóm nghi còn tồn tại nhưng chưa xác nhận?</w:t>
       </w:r>
@@ -23314,7 +23314,7 @@
           <w:numId w:val="0"/>
         </w:numPr>
       </w:pPr>
-      <w:bookmarkStart w:id="52" w:name="_Toc243827881"/>
+      <w:bookmarkStart w:id="52" w:name="_Toc244207178"/>
       <w:r>
         <w:lastRenderedPageBreak/>
         <w:t>10.3 Bài học lớn nhất về phương pháp</w:t>
@@ -23357,7 +23357,7 @@
           <w:numId w:val="0"/>
         </w:numPr>
       </w:pPr>
-      <w:bookmarkStart w:id="53" w:name="_Toc243827882"/>
+      <w:bookmarkStart w:id="53" w:name="_Toc244207179"/>
       <w:r>
         <w:rPr>
           <w:lang w:val="vi-VN"/>
@@ -23375,7 +23375,7 @@
           <w:numId w:val="0"/>
         </w:numPr>
       </w:pPr>
-      <w:bookmarkStart w:id="54" w:name="_Toc243827883"/>
+      <w:bookmarkStart w:id="54" w:name="_Toc244207180"/>
       <w:r>
         <w:rPr>
           <w:lang w:val="vi-VN"/>
@@ -23883,7 +23883,7 @@
           <w:numId w:val="0"/>
         </w:numPr>
       </w:pPr>
-      <w:bookmarkStart w:id="55" w:name="_Toc243827884"/>
+      <w:bookmarkStart w:id="55" w:name="_Toc244207181"/>
       <w:r>
         <w:rPr>
           <w:lang w:val="vi-VN"/>
@@ -23902,7 +23902,7 @@
           <w:numId w:val="0"/>
         </w:numPr>
       </w:pPr>
-      <w:bookmarkStart w:id="56" w:name="_Toc243827885"/>
+      <w:bookmarkStart w:id="56" w:name="_Toc244207182"/>
       <w:r>
         <w:rPr>
           <w:lang w:val="vi-VN"/>
@@ -26860,7 +26860,7 @@
           <w:numId w:val="0"/>
         </w:numPr>
       </w:pPr>
-      <w:bookmarkStart w:id="58" w:name="_Toc243827886"/>
+      <w:bookmarkStart w:id="58" w:name="_Toc244207183"/>
       <w:r>
         <w:rPr>
           <w:lang w:val="vi-VN"/>
@@ -29059,7 +29059,7 @@
           <w:numId w:val="0"/>
         </w:numPr>
       </w:pPr>
-      <w:bookmarkStart w:id="60" w:name="_Toc243827887"/>
+      <w:bookmarkStart w:id="60" w:name="_Toc244207184"/>
       <w:r>
         <w:rPr>
           <w:lang w:val="vi-VN"/>
@@ -29775,7 +29775,7 @@
                 <w:szCs w:val="22"/>
                 <w:lang w:val="vi-VN"/>
               </w:rPr>
-              <w:t>Sổ 816 hồ sơ case, tách kỳ vọng và kết quả thực tế</w:t>
+              <w:t>Sổ 822 hồ sơ case, tách kỳ vọng và kết quả thực tế</w:t>
             </w:r>
           </w:p>
         </w:tc>
@@ -30421,7 +30421,7 @@
       </w:r>
       <w:r>
         <w:br/>
-        <w:t>.venv/bin/python models/build_case_register.py     # sổ 816 hồ sơ</w:t>
+        <w:t>.venv/bin/python models/build_case_register.py     # sổ 822 hồ sơ</w:t>
       </w:r>
       <w:r>
         <w:br/>
@@ -30575,7 +30575,7 @@
           <w:numId w:val="0"/>
         </w:numPr>
       </w:pPr>
-      <w:bookmarkStart w:id="62" w:name="_Toc243827888"/>
+      <w:bookmarkStart w:id="62" w:name="_Toc244207185"/>
       <w:r>
         <w:rPr>
           <w:lang w:val="vi-VN"/>
@@ -30986,7 +30986,7 @@
                 <w:szCs w:val="22"/>
                 <w:lang w:val="vi-VN"/>
               </w:rPr>
-              <w:t>Bản mở rộng: 54 cặp truy vấn, 92 tham số, sổ 816 hồ sơ case</w:t>
+              <w:t>Bản mở rộng: 54 cặp truy vấn, 92 tham số, sổ 822 hồ sơ case</w:t>
             </w:r>
           </w:p>
         </w:tc>
@@ -31944,7 +31944,7 @@
           <w:numId w:val="0"/>
         </w:numPr>
       </w:pPr>
-      <w:bookmarkStart w:id="66" w:name="_Toc243827889"/>
+      <w:bookmarkStart w:id="66" w:name="_Toc244207186"/>
       <w:r>
         <w:lastRenderedPageBreak/>
         <w:t>11.3.10 Phụ lục J – Log đầy đủ của các lần chạy công cụ trước, sau khi vá</w:t>
@@ -41137,30 +41137,6 @@
 </file>
 
 <file path=customXml/item1.xml><?xml version="1.0" encoding="utf-8"?>
-<b:Sources xmlns:b="http://schemas.openxmlformats.org/officeDocument/2006/bibliography" xmlns="http://schemas.openxmlformats.org/officeDocument/2006/bibliography" SelectedStyle="\APASixthEditionOfficeOnline.xsl" StyleName="APA" Version="6"/>
-</file>
-
-<file path=customXml/item2.xml><?xml version="1.0" encoding="utf-8"?>
-<p:properties xmlns:p="http://schemas.microsoft.com/office/2006/metadata/properties" xmlns:xsi="http://www.w3.org/2001/XMLSchema-instance" xmlns:pc="http://schemas.microsoft.com/office/infopath/2007/PartnerControls">
-  <documentManagement>
-    <TaxCatchAll xmlns="5d0b22ea-e5ea-49c7-9b62-902e21e51f08" xsi:nil="true"/>
-    <lcf76f155ced4ddcb4097134ff3c332f xmlns="f6f721e1-8a62-40be-993d-f44352021507">
-      <Terms xmlns="http://schemas.microsoft.com/office/infopath/2007/PartnerControls"/>
-    </lcf76f155ced4ddcb4097134ff3c332f>
-  </documentManagement>
-</p:properties>
-</file>
-
-<file path=customXml/item3.xml><?xml version="1.0" encoding="utf-8"?>
-<?mso-contentType ?>
-<FormTemplates xmlns="http://schemas.microsoft.com/sharepoint/v3/contenttype/forms">
-  <Display>DocumentLibraryForm</Display>
-  <Edit>DocumentLibraryForm</Edit>
-  <New>DocumentLibraryForm</New>
-</FormTemplates>
-</file>
-
-<file path=customXml/item4.xml><?xml version="1.0" encoding="utf-8"?>
 <ct:contentTypeSchema xmlns:ct="http://schemas.microsoft.com/office/2006/metadata/contentType" xmlns:ma="http://schemas.microsoft.com/office/2006/metadata/properties/metaAttributes" ct:_="" ma:_="" ma:contentTypeName="Tài liệu" ma:contentTypeID="0x0101009064D6C488808240A931504663625519" ma:contentTypeVersion="14" ma:contentTypeDescription="Tạo tài liệu mới." ma:contentTypeScope="" ma:versionID="917cc4c3b82354d7a8f69433fdf51fae">
   <xsd:schema xmlns:xsd="http://www.w3.org/2001/XMLSchema" xmlns:xs="http://www.w3.org/2001/XMLSchema" xmlns:p="http://schemas.microsoft.com/office/2006/metadata/properties" xmlns:ns2="f6f721e1-8a62-40be-993d-f44352021507" xmlns:ns3="5d0b22ea-e5ea-49c7-9b62-902e21e51f08" targetNamespace="http://schemas.microsoft.com/office/2006/metadata/properties" ma:root="true" ma:fieldsID="2f9312a3ec803083f43100d41fb65ef5" ns2:_="" ns3:_="">
     <xsd:import namespace="f6f721e1-8a62-40be-993d-f44352021507"/>
@@ -41389,34 +41365,31 @@
 </ct:contentTypeSchema>
 </file>
 
-<file path=customXml/itemProps1.xml><?xml version="1.0" encoding="utf-8"?>
-<ds:datastoreItem xmlns:ds="http://schemas.openxmlformats.org/officeDocument/2006/customXml" ds:itemID="{06F34B39-710A-4AE8-9B09-0F6110FECC4E}">
-  <ds:schemaRefs>
-    <ds:schemaRef ds:uri="http://schemas.openxmlformats.org/officeDocument/2006/bibliography"/>
-  </ds:schemaRefs>
-</ds:datastoreItem>
+<file path=customXml/item2.xml><?xml version="1.0" encoding="utf-8"?>
+<?mso-contentType ?>
+<FormTemplates xmlns="http://schemas.microsoft.com/sharepoint/v3/contenttype/forms">
+  <Display>DocumentLibraryForm</Display>
+  <Edit>DocumentLibraryForm</Edit>
+  <New>DocumentLibraryForm</New>
+</FormTemplates>
 </file>
 
-<file path=customXml/itemProps2.xml><?xml version="1.0" encoding="utf-8"?>
-<ds:datastoreItem xmlns:ds="http://schemas.openxmlformats.org/officeDocument/2006/customXml" ds:itemID="{ACBFC553-1BE4-4450-B403-7F12C27FE3CA}">
-  <ds:schemaRefs>
-    <ds:schemaRef ds:uri="http://schemas.microsoft.com/office/2006/metadata/properties"/>
-    <ds:schemaRef ds:uri="http://schemas.microsoft.com/office/infopath/2007/PartnerControls"/>
-    <ds:schemaRef ds:uri="5d0b22ea-e5ea-49c7-9b62-902e21e51f08"/>
-    <ds:schemaRef ds:uri="f6f721e1-8a62-40be-993d-f44352021507"/>
-  </ds:schemaRefs>
-</ds:datastoreItem>
+<file path=customXml/item3.xml><?xml version="1.0" encoding="utf-8"?>
+<p:properties xmlns:p="http://schemas.microsoft.com/office/2006/metadata/properties" xmlns:xsi="http://www.w3.org/2001/XMLSchema-instance" xmlns:pc="http://schemas.microsoft.com/office/infopath/2007/PartnerControls">
+  <documentManagement>
+    <TaxCatchAll xmlns="5d0b22ea-e5ea-49c7-9b62-902e21e51f08" xsi:nil="true"/>
+    <lcf76f155ced4ddcb4097134ff3c332f xmlns="f6f721e1-8a62-40be-993d-f44352021507">
+      <Terms xmlns="http://schemas.microsoft.com/office/infopath/2007/PartnerControls"/>
+    </lcf76f155ced4ddcb4097134ff3c332f>
+  </documentManagement>
+</p:properties>
 </file>
 
-<file path=customXml/itemProps3.xml><?xml version="1.0" encoding="utf-8"?>
-<ds:datastoreItem xmlns:ds="http://schemas.openxmlformats.org/officeDocument/2006/customXml" ds:itemID="{4ED417DC-AAC6-4AC2-9B84-BF5AEE7392F8}">
-  <ds:schemaRefs>
-    <ds:schemaRef ds:uri="http://schemas.microsoft.com/sharepoint/v3/contenttype/forms"/>
-  </ds:schemaRefs>
-</ds:datastoreItem>
+<file path=customXml/item4.xml><?xml version="1.0" encoding="utf-8"?>
+<b:Sources xmlns:b="http://schemas.openxmlformats.org/officeDocument/2006/bibliography" xmlns="http://schemas.openxmlformats.org/officeDocument/2006/bibliography" SelectedStyle="\APASixthEditionOfficeOnline.xsl" StyleName="APA" Version="6"/>
 </file>
 
-<file path=customXml/itemProps4.xml><?xml version="1.0" encoding="utf-8"?>
+<file path=customXml/itemProps1.xml><?xml version="1.0" encoding="utf-8"?>
 <ds:datastoreItem xmlns:ds="http://schemas.openxmlformats.org/officeDocument/2006/customXml" ds:itemID="{DA04E85B-2A7D-4814-AE68-20A674C21DD2}">
   <ds:schemaRefs>
     <ds:schemaRef ds:uri="http://schemas.microsoft.com/office/2006/metadata/contentType"/>
@@ -41433,4 +41406,31 @@
     <ds:schemaRef ds:uri="http://schemas.microsoft.com/internal/obd"/>
   </ds:schemaRefs>
 </ds:datastoreItem>
+</file>
+
+<file path=customXml/itemProps2.xml><?xml version="1.0" encoding="utf-8"?>
+<ds:datastoreItem xmlns:ds="http://schemas.openxmlformats.org/officeDocument/2006/customXml" ds:itemID="{4ED417DC-AAC6-4AC2-9B84-BF5AEE7392F8}">
+  <ds:schemaRefs>
+    <ds:schemaRef ds:uri="http://schemas.microsoft.com/sharepoint/v3/contenttype/forms"/>
+  </ds:schemaRefs>
+</ds:datastoreItem>
+</file>
+
+<file path=customXml/itemProps3.xml><?xml version="1.0" encoding="utf-8"?>
+<ds:datastoreItem xmlns:ds="http://schemas.openxmlformats.org/officeDocument/2006/customXml" ds:itemID="{ACBFC553-1BE4-4450-B403-7F12C27FE3CA}">
+  <ds:schemaRefs>
+    <ds:schemaRef ds:uri="http://schemas.microsoft.com/office/2006/metadata/properties"/>
+    <ds:schemaRef ds:uri="http://schemas.microsoft.com/office/infopath/2007/PartnerControls"/>
+    <ds:schemaRef ds:uri="5d0b22ea-e5ea-49c7-9b62-902e21e51f08"/>
+    <ds:schemaRef ds:uri="f6f721e1-8a62-40be-993d-f44352021507"/>
+  </ds:schemaRefs>
+</ds:datastoreItem>
+</file>
+
+<file path=customXml/itemProps4.xml><?xml version="1.0" encoding="utf-8"?>
+<ds:datastoreItem xmlns:ds="http://schemas.openxmlformats.org/officeDocument/2006/customXml" ds:itemID="{06F34B39-710A-4AE8-9B09-0F6110FECC4E}">
+  <ds:schemaRefs>
+    <ds:schemaRef ds:uri="http://schemas.openxmlformats.org/officeDocument/2006/bibliography"/>
+  </ds:schemaRefs>
+</ds:datastoreItem>
 </file>
</xml_diff>